<commit_message>
Add CV v4 (PDF + DOCX), fix dead /cv/ 404, unlink APEX facility cards, move colophon card last, fix Craft filter arrow overlap
</commit_message>
<xml_diff>
--- a/public/cv/CV-David-Bitan.docx
+++ b/public/cv/CV-David-Bitan.docx
@@ -78,7 +78,7 @@
           <w:sz w:val="18"/>
           <w:szCs w:val="18"/>
         </w:rPr>
-        <w:t>Senior Product Designer with 20+ years across fintech, gaming, and AI-first startups. At Ryze Beyond (2019-2026): grew with the company from 32 to 110+ employees and carried product design across every vertical as sole senior designer, using AI-augmented workflows (Claude, ChatGPT, Midjourney, Figma AI) to hold the output of a three-person team. Deep expertise in component-based design systems, WCAG accessibility, user research, prototyping, and end-to-end product design from wireframe to shipped UI. Team contributor on Cactus d'Or, d'Argent and de Bronze wins (French advertising industry) at Publicis Group, 2006-2011.</w:t>
+        <w:t>Senior Product Designer with 20+ years across fintech, gaming, and AI-first startups. At Ryze Beyond (2019-2026): grew with the company from 32 to 110+ employees and carried product design across every vertical as sole senior designer, using AI-augmented workflows (Claude, ChatGPT, Midjourney, Figma AI) to hold the output of a three-person team. Deep expertise in component-based design systems, WCAG accessibility, user research, prototyping, and end-to-end product design from wireframe to shipped UI. Team contributor on 12+ Cactus wins (Or, Argent, de Bronze) — Israel's top advertising awards — at Arc Interactive, Publicis Group, 2006-2011.</w:t>
       </w:r>
     </w:p>
     <w:p>
@@ -953,7 +953,7 @@
           <w:sz w:val="18"/>
           <w:szCs w:val="18"/>
         </w:rPr>
-        <w:t>Multiple Cactus d'Or, Cactus d'Argent, and Cactus de Bronze awards (French advertising industry) — won yearly from 2006 to 2011 at Arc Interactive (Publicis Group), with individual credit as part of the creative team</w:t>
+        <w:t>12+ Cactus d'Or, Cactus d'Argent and Cactus de Bronze awards — Israel's top advertising awards — won yearly from 2006 to 2011 at Arc Interactive (Publicis Group), with individual credit as part of the creative team</w:t>
       </w:r>
     </w:p>
     <w:p>

</xml_diff>

<commit_message>
Copy consistency pass: Cactus awards are Israeli, five years not six, 20+ years everywhere, team framing by scope not headcount, 110+ headcount; regenerate CV
</commit_message>
<xml_diff>
--- a/public/cv/CV-David-Bitan.docx
+++ b/public/cv/CV-David-Bitan.docx
@@ -190,20 +190,20 @@
         <w:spacing w:after="75" w:line="284" w:lineRule="auto"/>
       </w:pPr>
       <w:r>
-        <w:t>Grew with the company from 32 to over 110 employees, driving product design across all platforms while the design team grew from 2 to 3 designers, whom I trained and mentored directly</w:t>
-      </w:r>
-    </w:p>
-    <w:p>
-      <w:pPr>
-        <w:pStyle w:val="ListParagraph"/>
-        <w:numPr>
-          <w:ilvl w:val="0"/>
-          <w:numId w:val="1"/>
-        </w:numPr>
-        <w:spacing w:after="75" w:line="284" w:lineRule="auto"/>
-      </w:pPr>
-      <w:r>
-        <w:t>Sustained the delivery output of the full three-person design team, and the design function was consolidated around a single senior designer</w:t>
+        <w:t>Grew with the company from 32 to over 110 employees, driving product design across all platforms as the sole designer on every company website and product</w:t>
+      </w:r>
+    </w:p>
+    <w:p>
+      <w:pPr>
+        <w:pStyle w:val="ListParagraph"/>
+        <w:numPr>
+          <w:ilvl w:val="0"/>
+          <w:numId w:val="1"/>
+        </w:numPr>
+        <w:spacing w:after="75" w:line="284" w:lineRule="auto"/>
+      </w:pPr>
+      <w:r>
+        <w:t>Sustained the delivery output of a full three-person design team; the design team varied from 1 to 4 people, with the other designers covering social media rather than product</w:t>
       </w:r>
     </w:p>
     <w:p>
@@ -953,7 +953,7 @@
           <w:sz w:val="18"/>
           <w:szCs w:val="18"/>
         </w:rPr>
-        <w:t>12+ Cactus d'Or, Cactus d'Argent and Cactus de Bronze awards — Israel's top advertising awards — won yearly from 2006 to 2011 at Arc Interactive (Publicis Group), with individual credit as part of the creative team</w:t>
+        <w:t>12+ Cactus d'Or, Cactus d'Argent and Cactus de Bronze awards — Israel's top advertising awards — won across five years at Arc Interactive (Publicis Group), 2006-2011, with individual credit as part of the creative team</w:t>
       </w:r>
     </w:p>
     <w:p>

</xml_diff>